<commit_message>
Add Training 15: Copilot Studio Training (Trainer + User guides)
</commit_message>
<xml_diff>
--- a/files/Master_Supply_Agreement_V1_Original.docx
+++ b/files/Master_Supply_Agreement_V1_Original.docx
@@ -75,7 +75,7 @@
           <w:sz w:val="28"/>
           <w:szCs w:val="28"/>
         </w:rPr>
-        <w:t>CONTOSO GROCERS, INC.</w:t>
+        <w:t>ALBERTSONS COMPANIES, INC.</w:t>
       </w:r>
     </w:p>
     <w:p>
@@ -212,19 +212,7 @@
         <w:spacing w:after="120" w:line="276" w:lineRule="auto"/>
       </w:pPr>
       <w:r>
-        <w:t xml:space="preserve">WHEREAS, </w:t>
-      </w:r>
-      <w:r>
-        <w:t>Contoso Grocers, Inc.</w:t>
-      </w:r>
-      <w:r>
-        <w:t xml:space="preserve"> ("Buyer") is a leading food and drug retailer operating over 2,200 stores across 34 states and the District of Columbia under various banners, including </w:t>
-      </w:r>
-      <w:r>
-        <w:t>Contoso Grocers</w:t>
-      </w:r>
-      <w:r>
-        <w:t>, and maintains an extensive network of distribution centers to service its retail locations throughout the Western United States;</w:t>
+        <w:t>WHEREAS, Albertsons Companies, Inc. ("Buyer") is a leading food and drug retailer operating over 2,200 stores across 34 states and the District of Columbia under various banners, including Albertsons, Safeway, Vons, Jewel-Osco, Shaw's, and ACME, and maintains an extensive network of distribution centers to service its retail locations throughout the Western United States;</w:t>
       </w:r>
     </w:p>
     <w:p>
@@ -422,13 +410,7 @@
         <w:spacing w:after="120" w:line="276" w:lineRule="auto"/>
       </w:pPr>
       <w:r>
-        <w:t xml:space="preserve">Supplier shall deliver Deliverables to Buyer's designated distribution centers located within the Territory, currently including but not limited to the following facilities: (a) Boise Distribution Center, </w:t>
-      </w:r>
-      <w:r>
-        <w:t>Denver, Colorado</w:t>
-      </w:r>
-      <w:r>
-        <w:t xml:space="preserve">; (b) Portland Distribution Center, Portland, Oregon; (c) Sacramento Distribution Center, Sacramento, California; (d) Los Angeles Distribution Center, Compton, California; (e) Phoenix Distribution Center, Phoenix, Arizona; (f) Denver Distribution Center, Aurora, Colorado; and (g) Seattle Distribution Center, Auburn, Washington. Buyer may, upon thirty (30) days' prior written notice to Supplier, add or remove distribution centers from the </w:t>
+        <w:t xml:space="preserve">Supplier shall deliver Deliverables to Buyer's designated distribution centers located within the Territory, currently including but not limited to the following facilities: (a) Boise Distribution Center, Boise, Idaho; (b) Portland Distribution Center, Portland, Oregon; (c) Sacramento Distribution Center, Sacramento, California; (d) Los Angeles Distribution Center, Compton, California; (e) Phoenix Distribution Center, Phoenix, Arizona; (f) Denver Distribution Center, Aurora, Colorado; and (g) Seattle Distribution Center, Auburn, Washington. Buyer may, upon thirty (30) days' prior written notice to Supplier, add or remove distribution centers from the </w:t>
       </w:r>
       <w:r>
         <w:lastRenderedPageBreak/>
@@ -716,7 +698,11 @@
         <w:spacing w:after="120" w:line="276" w:lineRule="auto"/>
       </w:pPr>
       <w:r>
-        <w:t>Buyer shall have the right, upon reasonable prior notice (not less than forty-eight (48) hours except in the case of a food safety emergency), to conduct audits and inspections of Supplier's facilities, operations, records, and quality management systems to verify compliance with this Agreement, applicable laws, and Buyer's quality standards. Such audits may be conducted by Buyer's internal quality assurance personnel or by qualified third-party auditors engaged by Buyer. Supplier shall cooperate fully with all such audits and shall provide Buyer's auditors with reasonable access to facilities, personnel, and records. In the event any audit reveals material non-compliance, Supplier shall develop and implement a corrective action plan within fifteen (15) days, subject to Buyer's approval, and Buyer may conduct follow-up audits at Supplier's expense to verify implementation.</w:t>
+        <w:t xml:space="preserve">Buyer shall have the right, upon reasonable prior notice (not less than forty-eight (48) hours except in the case of a food safety emergency), to conduct audits and inspections of Supplier's facilities, operations, records, and quality management systems to verify compliance with this Agreement, applicable laws, and Buyer's quality standards. Such audits may be conducted by Buyer's internal quality assurance personnel or by qualified third-party auditors engaged by Buyer. Supplier shall cooperate fully with all such audits and shall provide Buyer's auditors with </w:t>
+      </w:r>
+      <w:r>
+        <w:lastRenderedPageBreak/>
+        <w:t>reasonable access to facilities, personnel, and records. In the event any audit reveals material non-compliance, Supplier shall develop and implement a corrective action plan within fifteen (15) days, subject to Buyer's approval, and Buyer may conduct follow-up audits at Supplier's expense to verify implementation.</w:t>
       </w:r>
     </w:p>
     <w:p>
@@ -802,6 +788,7 @@
           <w:b/>
           <w:bCs/>
         </w:rPr>
+        <w:lastRenderedPageBreak/>
         <w:t>6.3 Risk of Loss.</w:t>
       </w:r>
     </w:p>
@@ -884,7 +871,11 @@
         <w:spacing w:after="120" w:line="276" w:lineRule="auto"/>
       </w:pPr>
       <w:r>
-        <w:t>Supplier additionally represents and warrants that: (a) all Deliverables supplied under this Agreement shall be merchantable, fit for human consumption, and free from adulteration, contamination, and defects; (b) all Deliverables shall conform to the product specifications, quality standards, and grading requirements specified by Buyer; (c) all Deliverables shall be produced, processed, packaged, stored, and transported in compliance with all applicable federal, state, and local food safety laws and regulations; (d) Supplier maintains and shall continue to maintain adequate food safety management systems, including Hazard Analysis and Critical Control Points ("HACCP") plans, where applicable; (e) all organic products shall be certified organic in accordance with the USDA National Organic Program; and (f) Supplier has not been and is not currently debarred, suspended, or proposed for debarment by any federal or state agency.</w:t>
+        <w:t xml:space="preserve">Supplier additionally represents and warrants that: (a) all Deliverables supplied under this Agreement shall be merchantable, fit for human consumption, and free from adulteration, contamination, and defects; (b) all Deliverables shall conform to the product specifications, quality standards, and grading requirements specified by Buyer; (c) all Deliverables shall be produced, processed, packaged, stored, and transported in compliance with all applicable federal, </w:t>
+      </w:r>
+      <w:r>
+        <w:lastRenderedPageBreak/>
+        <w:t>state, and local food safety laws and regulations; (d) Supplier maintains and shall continue to maintain adequate food safety management systems, including Hazard Analysis and Critical Control Points ("HACCP") plans, where applicable; (e) all organic products shall be certified organic in accordance with the USDA National Organic Program; and (f) Supplier has not been and is not currently debarred, suspended, or proposed for debarment by any federal or state agency.</w:t>
       </w:r>
     </w:p>
     <w:p>
@@ -958,7 +949,11 @@
         <w:spacing w:after="120" w:line="276" w:lineRule="auto"/>
       </w:pPr>
       <w:r>
-        <w:t>Buyer shall indemnify, defend, and hold harmless Supplier and its members, managers, officers, employees, agents, successors, and assigns (collectively, the "Supplier Indemnitees") from and against any and all Losses arising out of or relating to: (a) any breach of Buyer's representations, warranties, or obligations under this Agreement; (b) any claims arising from Buyer's handling, storage, or sale of Deliverables after acceptance at the Delivery Point, except to the extent caused by Supplier's breach of this Agreement or the defective condition of the Deliverables at the time of delivery; (c) any violation of applicable law by Buyer; and (d) any claim of infringement or misappropriation of Intellectual Property rights arising from Buyer's proprietary specifications or private label branding.</w:t>
+        <w:t xml:space="preserve">Buyer shall indemnify, defend, and hold harmless Supplier and its members, managers, officers, employees, agents, successors, and assigns (collectively, the "Supplier Indemnitees") from and against any and all Losses arising out of or relating to: (a) any breach of Buyer's representations, warranties, or obligations under this Agreement; (b) any claims arising from Buyer's handling, storage, or sale of Deliverables after acceptance at the Delivery Point, except to the extent caused by Supplier's breach of this Agreement or the defective condition of the Deliverables at the time of delivery; (c) any violation of applicable law by Buyer; and (d) any claim of infringement or </w:t>
+      </w:r>
+      <w:r>
+        <w:lastRenderedPageBreak/>
+        <w:t>misappropriation of Intellectual Property rights arising from Buyer's proprietary specifications or private label branding.</w:t>
       </w:r>
     </w:p>
     <w:p>
@@ -1032,7 +1027,11 @@
         <w:spacing w:after="120" w:line="276" w:lineRule="auto"/>
       </w:pPr>
       <w:r>
-        <w:t>EXCEPT FOR OBLIGATIONS ARISING UNDER SECTION 8 (INDEMNIFICATION) AND SECTION 12 (CONFIDENTIALITY), IN NO EVENT SHALL EITHER PARTY BE LIABLE TO THE OTHER PARTY FOR ANY INDIRECT, INCIDENTAL, SPECIAL, CONSEQUENTIAL, PUNITIVE, OR EXEMPLARY DAMAGES, INCLUDING BUT NOT LIMITED TO DAMAGES FOR LOSS OF PROFITS, LOSS OF REVENUE, LOSS OF BUSINESS, LOSS OF GOODWILL, LOSS OF DATA, OR COST OF PROCUREMENT OF SUBSTITUTE GOODS OR SERVICES, REGARDLESS OF THE CAUSE OF ACTION OR THE THEORY OF LIABILITY, WHETHER IN CONTRACT, TORT (INCLUDING NEGLIGENCE), STRICT LIABILITY, OR OTHERWISE, EVEN IF SUCH PARTY HAS BEEN ADVISED OF THE POSSIBILITY OF SUCH DAMAGES.</w:t>
+        <w:t xml:space="preserve">EXCEPT FOR OBLIGATIONS ARISING UNDER SECTION 8 (INDEMNIFICATION) AND SECTION 12 (CONFIDENTIALITY), IN NO EVENT SHALL EITHER PARTY BE LIABLE TO THE OTHER PARTY FOR ANY INDIRECT, INCIDENTAL, SPECIAL, CONSEQUENTIAL, PUNITIVE, OR EXEMPLARY DAMAGES, INCLUDING BUT NOT LIMITED TO DAMAGES FOR LOSS OF PROFITS, LOSS OF REVENUE, LOSS OF BUSINESS, LOSS OF GOODWILL, LOSS OF DATA, OR COST OF PROCUREMENT OF SUBSTITUTE GOODS OR SERVICES, REGARDLESS OF THE CAUSE OF ACTION OR THE THEORY OF LIABILITY, WHETHER IN CONTRACT, TORT (INCLUDING </w:t>
+      </w:r>
+      <w:r>
+        <w:lastRenderedPageBreak/>
+        <w:t>NEGLIGENCE), STRICT LIABILITY, OR OTHERWISE, EVEN IF SUCH PARTY HAS BEEN ADVISED OF THE POSSIBILITY OF SUCH DAMAGES.</w:t>
       </w:r>
     </w:p>
     <w:p>
@@ -1126,13 +1125,8 @@
         <w:spacing w:after="120" w:line="276" w:lineRule="auto"/>
       </w:pPr>
       <w:r>
-        <w:t xml:space="preserve">All insurance policies required under this Section 10 shall: (a) name </w:t>
-      </w:r>
-      <w:r>
-        <w:t>Contoso Grocers, Inc.</w:t>
-      </w:r>
-      <w:r>
-        <w:t xml:space="preserve"> and its parent, subsidiaries, and affiliates as additional insureds (except Workers' Compensation); (b) be primary and non-contributory to any insurance maintained by Buyer; (c) include a waiver of subrogation in favor of Buyer; and (d) provide that Buyer shall receive no less than thirty (30) days' prior written notice of any cancellation, non-renewal, or material modification of coverage. Supplier shall provide Buyer with certificates of insurance evidencing the required coverage within ten (10) days of the Effective Date and annually thereafter, and shall promptly provide copies of endorsements or policies upon Buyer's reasonable request.</w:t>
+        <w:lastRenderedPageBreak/>
+        <w:t>All insurance policies required under this Section 10 shall: (a) name Albertsons Companies, Inc. and its parent, subsidiaries, and affiliates as additional insureds (except Workers' Compensation); (b) be primary and non-contributory to any insurance maintained by Buyer; (c) include a waiver of subrogation in favor of Buyer; and (d) provide that Buyer shall receive no less than thirty (30) days' prior written notice of any cancellation, non-renewal, or material modification of coverage. Supplier shall provide Buyer with certificates of insurance evidencing the required coverage within ten (10) days of the Effective Date and annually thereafter, and shall promptly provide copies of endorsements or policies upon Buyer's reasonable request.</w:t>
       </w:r>
     </w:p>
     <w:p>
@@ -1226,6 +1220,7 @@
         <w:spacing w:after="120" w:line="276" w:lineRule="auto"/>
       </w:pPr>
       <w:r>
+        <w:lastRenderedPageBreak/>
         <w:t>Upon the termination or expiration of this Agreement, or upon the written request of the Disclosing Party, the Receiving Party shall promptly return or, at the Disclosing Party's election, destroy all Confidential Information of the Disclosing Party in its possession or control, including all copies, excerpts, and summaries thereof. The Receiving Party shall certify in writing to the Disclosing Party that it has complied with its obligations under this Section 11.3, provided that the Receiving Party may retain one (1) archival copy of such Confidential Information solely for purposes of monitoring compliance with this Agreement.</w:t>
       </w:r>
     </w:p>
@@ -1320,7 +1315,11 @@
         <w:spacing w:after="120" w:line="276" w:lineRule="auto"/>
       </w:pPr>
       <w:r>
-        <w:t>Notwithstanding Sections 12.1 and 12.2, either party may terminate this Agreement immediately upon written notice to the other party if: (a) the other party becomes insolvent, makes a general assignment for the benefit of creditors, files a voluntary petition in bankruptcy, or has an involuntary petition in bankruptcy filed against it that is not dismissed within sixty (60) days; (b) the other party is subject to a material fraud or regulatory action that materially impairs its ability to perform under this Agreement; (c) Supplier delivers Deliverables that are adulterated, contaminated, or otherwise unfit for human consumption and such condition poses an imminent risk to public health or safety; or (d) a Force Majeure Event continues for more than one hundred twenty (120) consecutive days.</w:t>
+        <w:t xml:space="preserve">Notwithstanding Sections 12.1 and 12.2, either party may terminate this Agreement immediately upon written notice to the other party if: (a) the other party becomes insolvent, makes a general </w:t>
+      </w:r>
+      <w:r>
+        <w:lastRenderedPageBreak/>
+        <w:t>assignment for the benefit of creditors, files a voluntary petition in bankruptcy, or has an involuntary petition in bankruptcy filed against it that is not dismissed within sixty (60) days; (b) the other party is subject to a material fraud or regulatory action that materially impairs its ability to perform under this Agreement; (c) Supplier delivers Deliverables that are adulterated, contaminated, or otherwise unfit for human consumption and such condition poses an imminent risk to public health or safety; or (d) a Force Majeure Event continues for more than one hundred twenty (120) consecutive days.</w:t>
       </w:r>
     </w:p>
     <w:p>
@@ -1414,6 +1413,7 @@
         <w:spacing w:after="120" w:line="276" w:lineRule="auto"/>
       </w:pPr>
       <w:r>
+        <w:lastRenderedPageBreak/>
         <w:t>During the pendency of a Force Majeure Event affecting Supplier's performance, Buyer shall have the right to procure substitute Deliverables from alternative suppliers without liability to Supplier and without such procurement being deemed a breach of any exclusivity or volume commitment provisions of this Agreement. Any additional costs incurred by Buyer in procuring substitute Deliverables during a Force Majeure Event that are attributable to Supplier's non-performance shall be borne by the parties in accordance with the allocation principles set forth in Section 13.2.</w:t>
       </w:r>
     </w:p>
@@ -1488,13 +1488,7 @@
         <w:spacing w:after="120" w:line="276" w:lineRule="auto"/>
       </w:pPr>
       <w:r>
-        <w:t xml:space="preserve">If the Dispute is not resolved through executive escalation within the time periods specified in Section 14.1, either party may submit the Dispute to non-binding mediation administered by a mutually agreed-upon mediator in </w:t>
-      </w:r>
-      <w:r>
-        <w:t>Denver, Colorado</w:t>
-      </w:r>
-      <w:r>
-        <w:t>. If the parties cannot agree on a mediator within ten (10) business days, the mediator shall be selected by the American Arbitration Association ("AAA"). The mediation shall be conducted in accordance with the AAA Commercial Mediation Procedures then in effect. Each party shall bear its own costs of mediation, and the parties shall share equally the fees and expenses of the mediator. The mediation shall be completed within sixty (60) days of the initial mediation session, unless extended by mutual written agreement.</w:t>
+        <w:t>If the Dispute is not resolved through executive escalation within the time periods specified in Section 14.1, either party may submit the Dispute to non-binding mediation administered by a mutually agreed-upon mediator in Boise, Idaho. If the parties cannot agree on a mediator within ten (10) business days, the mediator shall be selected by the American Arbitration Association ("AAA"). The mediation shall be conducted in accordance with the AAA Commercial Mediation Procedures then in effect. Each party shall bear its own costs of mediation, and the parties shall share equally the fees and expenses of the mediator. The mediation shall be completed within sixty (60) days of the initial mediation session, unless extended by mutual written agreement.</w:t>
       </w:r>
     </w:p>
     <w:p>
@@ -1514,19 +1508,8 @@
         <w:spacing w:after="120" w:line="276" w:lineRule="auto"/>
       </w:pPr>
       <w:r>
-        <w:t xml:space="preserve">If the Dispute is not resolved through mediation within the time periods specified in Section 14.2, either party may submit the Dispute to final and binding arbitration administered by the AAA in accordance with its Commercial Arbitration Rules then in effect. The arbitration shall be conducted in </w:t>
-      </w:r>
-      <w:r>
-        <w:t>Denver, Colorado</w:t>
-      </w:r>
-      <w:r>
-        <w:t xml:space="preserve"> before a panel of three (3) arbitrators, with each party selecting one (1) arbitrator and the two party-selected arbitrators selecting the third arbitrator, who shall serve as the chair of the panel. The arbitrators shall have expertise in commercial contracts and, to the extent practicable, the food and agriculture industry. The arbitrators shall apply the substantive law of </w:t>
-      </w:r>
-      <w:r>
-        <w:t>the State of Colorado</w:t>
-      </w:r>
-      <w:r>
-        <w:t>. The award of the arbitrators shall be final and binding upon the parties and may be entered as a judgment in any court of competent jurisdiction. Each party shall bear its own costs and attorneys' fees in connection with the arbitration, unless the arbitrators determine that one party's position was frivolous or advanced in bad faith, in which case the arbitrators may award reasonable attorneys' fees and costs to the prevailing party.</w:t>
+        <w:lastRenderedPageBreak/>
+        <w:t>If the Dispute is not resolved through mediation within the time periods specified in Section 14.2, either party may submit the Dispute to final and binding arbitration administered by the AAA in accordance with its Commercial Arbitration Rules then in effect. The arbitration shall be conducted in Boise, Idaho before a panel of three (3) arbitrators, with each party selecting one (1) arbitrator and the two party-selected arbitrators selecting the third arbitrator, who shall serve as the chair of the panel. The arbitrators shall have expertise in commercial contracts and, to the extent practicable, the food and agriculture industry. The arbitrators shall apply the substantive law of the State of Idaho. The award of the arbitrators shall be final and binding upon the parties and may be entered as a judgment in any court of competent jurisdiction. Each party shall bear its own costs and attorneys' fees in connection with the arbitration, unless the arbitrators determine that one party's position was frivolous or advanced in bad faith, in which case the arbitrators may award reasonable attorneys' fees and costs to the prevailing party.</w:t>
       </w:r>
     </w:p>
     <w:p>
@@ -1580,13 +1563,7 @@
         <w:spacing w:after="120" w:line="276" w:lineRule="auto"/>
       </w:pPr>
       <w:r>
-        <w:t xml:space="preserve">This Agreement shall be governed by and construed in accordance with the laws of </w:t>
-      </w:r>
-      <w:r>
-        <w:t>the State of Colorado</w:t>
-      </w:r>
-      <w:r>
-        <w:t>, without giving effect to any choice or conflict of law provision or rule that would cause the application of the laws of any other jurisdiction. The United Nations Convention on Contracts for the International Sale of Goods shall not apply to this Agreement.</w:t>
+        <w:t>This Agreement shall be governed by and construed in accordance with the laws of the State of Idaho, without giving effect to any choice or conflict of law provision or rule that would cause the application of the laws of any other jurisdiction. The United Nations Convention on Contracts for the International Sale of Goods shall not apply to this Agreement.</w:t>
       </w:r>
     </w:p>
     <w:p>
@@ -1626,6 +1603,7 @@
         <w:spacing w:after="120" w:line="276" w:lineRule="auto"/>
       </w:pPr>
       <w:r>
+        <w:lastRenderedPageBreak/>
         <w:t>All notices, requests, demands, and other communications required or permitted under this Agreement shall be in writing and shall be deemed to have been duly given: (a) when delivered personally; (b) one (1) business day after being sent by nationally recognized overnight courier; (c) three (3) business days after being mailed by certified mail, return receipt requested, postage prepaid; or (d) when transmitted by email with confirmed receipt. Notices shall be directed to the parties at the addresses set forth on the signature page hereof, or to such other address as either party may specify by written notice to the other party.</w:t>
       </w:r>
     </w:p>
@@ -1726,6 +1704,7 @@
         <w:spacing w:after="120" w:line="276" w:lineRule="auto"/>
       </w:pPr>
       <w:r>
+        <w:lastRenderedPageBreak/>
         <w:t>This Agreement may be executed in any number of counterparts, each of which shall be deemed an original and all of which together shall constitute one and the same instrument. This Agreement may be executed by electronic signature, which shall be deemed to have the same legal effect as an original signature.</w:t>
       </w:r>
     </w:p>
@@ -1739,6 +1718,7 @@
         <w:spacing w:before="240" w:after="480"/>
       </w:pPr>
       <w:r>
+        <w:lastRenderedPageBreak/>
         <w:t>IN WITNESS WHEREOF, the parties hereto have caused this Agreement to be executed by their duly authorized representatives as of the Effective Date first written above.</w:t>
       </w:r>
     </w:p>
@@ -1761,7 +1741,7 @@
           <w:b/>
           <w:bCs/>
         </w:rPr>
-        <w:t>CONTOSO GROCERS, INC.</w:t>
+        <w:t>ALBERTSONS COMPANIES, INC.</w:t>
       </w:r>
     </w:p>
     <w:p>
@@ -1823,7 +1803,7 @@
         <w:spacing w:after="120" w:line="276" w:lineRule="auto"/>
       </w:pPr>
       <w:r>
-        <w:t>Contoso Grocers, Inc.</w:t>
+        <w:t>Albertsons Companies, Inc.</w:t>
       </w:r>
     </w:p>
     <w:p>
@@ -1839,10 +1819,7 @@
         <w:spacing w:after="120" w:line="276" w:lineRule="auto"/>
       </w:pPr>
       <w:r>
-        <w:t>Denver, Colorado</w:t>
-      </w:r>
-      <w:r>
-        <w:t xml:space="preserve"> 83706</w:t>
+        <w:t>Boise, Idaho 83706</w:t>
       </w:r>
     </w:p>
     <w:p>
@@ -1858,13 +1835,7 @@
         <w:spacing w:after="120" w:line="276" w:lineRule="auto"/>
       </w:pPr>
       <w:r>
-        <w:t>Email: legalnotices@</w:t>
-      </w:r>
-      <w:r>
-        <w:t>Contoso Grocers</w:t>
-      </w:r>
-      <w:r>
-        <w:t>.com</w:t>
+        <w:t>Email: legalnotices@albertsons.com</w:t>
       </w:r>
     </w:p>
     <w:p>
@@ -1977,6 +1948,7 @@
         <w:spacing w:after="120" w:line="276" w:lineRule="auto"/>
       </w:pPr>
       <w:r>
+        <w:lastRenderedPageBreak/>
         <w:t>Attn: Chief Executive Officer</w:t>
       </w:r>
     </w:p>

</xml_diff>